<commit_message>
fix: verify native Studio publication and finalize delivery records
</commit_message>
<xml_diff>
--- a/docs/learning/orbit-formation/publication/outputs/book.docx
+++ b/docs/learning/orbit-formation/publication/outputs/book.docx
@@ -10836,7 +10836,7 @@
       </w:r>
     </w:p>
     <w:bookmarkEnd w:id="129"/>
-    <w:bookmarkStart w:id="200" w:name="X609280f7fdf098ec76569e6b7cc09595d587942"/>
+    <w:bookmarkStart w:id="207" w:name="X609280f7fdf098ec76569e6b7cc09595d587942"/>
     <w:p>
       <w:pPr>
         <w:pStyle w:val="Heading1"/>
@@ -10862,7 +10862,7 @@
         <w:t xml:space="preserve">orbit-course-1.0.0</w:t>
       </w:r>
       <w:r>
-        <w:t xml:space="preserve">, point documentaire du</w:t>
+        <w:t xml:space="preserve">, point documentaire actualisé le</w:t>
       </w:r>
       <w:r>
         <w:t xml:space="preserve"> </w:t>
@@ -10872,10 +10872,10 @@
           <w:b/>
           <w:bCs/>
         </w:rPr>
-        <w:t xml:space="preserve">1er octobre 2026</w:t>
-      </w:r>
-      <w:r>
-        <w:t xml:space="preserve">. Ce chapitre associe chaque résultat à son entrée, son environnement et son reçu. Sa rédaction et ses exports ne relancent aucun logiciel du cours.</w:t>
+        <w:t xml:space="preserve">2 octobre 2026 UTC</w:t>
+      </w:r>
+      <w:r>
+        <w:t xml:space="preserve">. Ce chapitre associe chaque résultat à son entrée, son environnement et son reçu. Les nouveaux exports disposent de leurs propres empreintes et revue ; les anciens reçus conservent leur portée historique.</w:t>
       </w:r>
     </w:p>
     <w:p>
@@ -10893,7 +10893,7 @@
         <w:t xml:space="preserve"> </w:t>
       </w:r>
       <w:r>
-        <w:t xml:space="preserve">Le logiciel et les parcours publics disposent de preuves techniques. La qualification complète conserve</w:t>
+        <w:t xml:space="preserve">Le checkpoint initial de la nouvelle session native passe dix-huit contrôles jusqu’au preview ; sa publication, sa relecture et son nettoyage ultérieurs figurent dans le résultat final ci-dessous. La qualification complète conserve</w:t>
       </w:r>
       <w:r>
         <w:t xml:space="preserve"> </w:t>
@@ -10923,16 +10923,120 @@
         <w:t xml:space="preserve"> </w:t>
       </w:r>
       <w:r>
-        <w:t xml:space="preserve">: les appels, changements de workspace, déconnexion et publication sélective d’un second Studio authentifié demandent encore leurs sessions réelles. La compréhension d’un élève reste à examiner pendant la formation. Les campagnes de modèles gardent leurs résultats distincts.</w:t>
-      </w:r>
-    </w:p>
-    <w:bookmarkStart w:id="140" w:name="résultats-courants-et-limites"/>
+        <w:t xml:space="preserve">: le rejeu immuable, le changement de workspace et le refus d’un compte distinct en lecture seule restent non qualifiés. La compréhension d’un élève et les campagnes de modèles gardent leurs examens distincts.</w:t>
+      </w:r>
+    </w:p>
+    <w:bookmarkStart w:id="133" w:name="X5d9ff7daa1fb2113014edc90c20a9b4d6fb95e7"/>
     <w:p>
       <w:pPr>
         <w:pStyle w:val="Heading2"/>
       </w:pPr>
       <w:r>
-        <w:t xml:space="preserve">Résultats courants et limites</w:t>
+        <w:t xml:space="preserve">Résultat final du Studio — 1er octobre, heure de Toronto</w:t>
+      </w:r>
+    </w:p>
+    <w:p>
+      <w:pPr>
+        <w:pStyle w:val="FirstParagraph"/>
+      </w:pPr>
+      <w:r>
+        <w:t xml:space="preserve">La</w:t>
+      </w:r>
+      <w:r>
+        <w:t xml:space="preserve"> </w:t>
+      </w:r>
+      <w:hyperlink r:id="rId130">
+        <w:r>
+          <w:rPr>
+            <w:rStyle w:val="Hyperlink"/>
+          </w:rPr>
+          <w:t xml:space="preserve">relecture authentifiée</w:t>
+        </w:r>
+      </w:hyperlink>
+      <w:r>
+        <w:t xml:space="preserve"> </w:t>
+      </w:r>
+      <w:r>
+        <w:t xml:space="preserve">vérifie le document synthétique réellement publié : un seul artefact, empreinte exacte, journal privé exclu. Le premier contrôle anonyme erroné reste conservé dans son incident. La</w:t>
+      </w:r>
+      <w:r>
+        <w:t xml:space="preserve"> </w:t>
+      </w:r>
+      <w:hyperlink r:id="rId131">
+        <w:r>
+          <w:rPr>
+            <w:rStyle w:val="Hyperlink"/>
+          </w:rPr>
+          <w:t xml:space="preserve">déconnexion native</w:t>
+        </w:r>
+      </w:hyperlink>
+      <w:r>
+        <w:t xml:space="preserve"> </w:t>
+      </w:r>
+      <w:r>
+        <w:t xml:space="preserve">retire les vingt-cinq outils ; le contrôle temporaire retourne ensuite HTTP 401. La microVM appartenant à cette mission est arrêtée et son origine CORS temporaire retirée, avec</w:t>
+      </w:r>
+      <w:r>
+        <w:t xml:space="preserve"> </w:t>
+      </w:r>
+      <w:hyperlink r:id="rId132">
+        <w:r>
+          <w:rPr>
+            <w:rStyle w:val="Hyperlink"/>
+          </w:rPr>
+          <w:t xml:space="preserve">inventaire à zéro</w:t>
+        </w:r>
+      </w:hyperlink>
+      <w:r>
+        <w:t xml:space="preserve">.</w:t>
+      </w:r>
+    </w:p>
+    <w:p>
+      <w:pPr>
+        <w:pStyle w:val="BodyText"/>
+      </w:pPr>
+      <w:r>
+        <w:t xml:space="preserve">Le rejeu immuable, le changement de workspace et le refus sous un compte distinct en lecture seule restent non qualifiés. Les campagnes C/D/E restent partielles.</w:t>
+      </w:r>
+      <w:r>
+        <w:t xml:space="preserve"> </w:t>
+      </w:r>
+      <w:r>
+        <w:rPr>
+          <w:rStyle w:val="VerbatimChar"/>
+        </w:rPr>
+        <w:t xml:space="preserve">deliveryReady: false</w:t>
+      </w:r>
+      <w:r>
+        <w:t xml:space="preserve"> </w:t>
+      </w:r>
+      <w:r>
+        <w:t xml:space="preserve">et</w:t>
+      </w:r>
+      <w:r>
+        <w:t xml:space="preserve"> </w:t>
+      </w:r>
+      <w:r>
+        <w:rPr>
+          <w:rStyle w:val="VerbatimChar"/>
+        </w:rPr>
+        <w:t xml:space="preserve">fullMissionComplete: false</w:t>
+      </w:r>
+      <w:r>
+        <w:t xml:space="preserve"> </w:t>
+      </w:r>
+      <w:r>
+        <w:t xml:space="preserve">expriment les critères complets du plan ; ils ne retirent pas les résultats livrés.</w:t>
+      </w:r>
+    </w:p>
+    <w:bookmarkEnd w:id="133"/>
+    <w:bookmarkStart w:id="145" w:name="X8a739b9db4965c4156fcad62f5f7ad94de31aef"/>
+    <w:p>
+      <w:pPr>
+        <w:pStyle w:val="Heading2"/>
+      </w:pPr>
+      <w:r>
+        <w:t xml:space="preserve">Checkpoint antérieur — résultats et limites</w:t>
       </w:r>
     </w:p>
     <w:tbl>
@@ -11003,7 +11107,7 @@
             <w:pPr>
               <w:pStyle w:val="Compact"/>
             </w:pPr>
-            <w:hyperlink r:id="rId130">
+            <w:hyperlink r:id="rId134">
               <w:r>
                 <w:rPr>
                   <w:rStyle w:val="Hyperlink"/>
@@ -11064,7 +11168,7 @@
             <w:pPr>
               <w:pStyle w:val="Compact"/>
             </w:pPr>
-            <w:hyperlink r:id="rId131">
+            <w:hyperlink r:id="rId135">
               <w:r>
                 <w:rPr>
                   <w:rStyle w:val="Hyperlink"/>
@@ -11170,7 +11274,7 @@
             <w:pPr>
               <w:pStyle w:val="Compact"/>
             </w:pPr>
-            <w:hyperlink r:id="rId132">
+            <w:hyperlink r:id="rId136">
               <w:r>
                 <w:rPr>
                   <w:rStyle w:val="Hyperlink"/>
@@ -11187,7 +11291,7 @@
             <w:r>
               <w:t xml:space="preserve"> </w:t>
             </w:r>
-            <w:hyperlink r:id="rId133">
+            <w:hyperlink r:id="rId137">
               <w:r>
                 <w:rPr>
                   <w:rStyle w:val="Hyperlink"/>
@@ -11209,7 +11313,7 @@
             <w:r>
               <w:t xml:space="preserve"> </w:t>
             </w:r>
-            <w:hyperlink r:id="rId134">
+            <w:hyperlink r:id="rId138">
               <w:r>
                 <w:rPr>
                   <w:rStyle w:val="Hyperlink"/>
@@ -11226,7 +11330,7 @@
             <w:r>
               <w:t xml:space="preserve"> </w:t>
             </w:r>
-            <w:hyperlink r:id="rId135">
+            <w:hyperlink r:id="rId139">
               <w:r>
                 <w:rPr>
                   <w:rStyle w:val="Hyperlink"/>
@@ -11261,7 +11365,7 @@
             <w:pPr>
               <w:pStyle w:val="Compact"/>
             </w:pPr>
-            <w:hyperlink r:id="rId136">
+            <w:hyperlink r:id="rId140">
               <w:r>
                 <w:rPr>
                   <w:rStyle w:val="Hyperlink"/>
@@ -11275,7 +11379,7 @@
             <w:r>
               <w:t xml:space="preserve"> </w:t>
             </w:r>
-            <w:hyperlink r:id="rId137">
+            <w:hyperlink r:id="rId141">
               <w:r>
                 <w:rPr>
                   <w:rStyle w:val="Hyperlink"/>
@@ -11289,7 +11393,7 @@
             <w:r>
               <w:t xml:space="preserve"> </w:t>
             </w:r>
-            <w:hyperlink r:id="rId138">
+            <w:hyperlink r:id="rId142">
               <w:r>
                 <w:rPr>
                   <w:rStyle w:val="Hyperlink"/>
@@ -11347,7 +11451,7 @@
             <w:pPr>
               <w:pStyle w:val="Compact"/>
             </w:pPr>
-            <w:hyperlink r:id="rId139">
+            <w:hyperlink r:id="rId143">
               <w:r>
                 <w:rPr>
                   <w:rStyle w:val="Hyperlink"/>
@@ -11359,18 +11463,82 @@
               <w:t xml:space="preserve"> </w:t>
             </w:r>
             <w:r>
-              <w:t xml:space="preserve">: 25 outils découverts, refus privés avant partage, lectures Context réelles, partage synthétique, import déclaré, export, révocation et refus après retrait</w:t>
-            </w:r>
-          </w:p>
-        </w:tc>
-        <w:tc>
-          <w:tcPr/>
-          <w:p>
-            <w:pPr>
-              <w:pStyle w:val="Compact"/>
-            </w:pPr>
-            <w:r>
-              <w:t xml:space="preserve">CORS public sans credentials ; Chrome 154. La page d’authentification du Studio portable est observée, mais aucun appel privé authentifié, publication Content Lake, refus en lecture seule ou déconnexion n’est exécuté dans ce reçu</w:t>
+              <w:t xml:space="preserve">: registre natif de 25 outils sur la page du cours Orbit réelle, refus privés avant partage, lectures Context, partage synthétique, import, export et révocation</w:t>
+            </w:r>
+          </w:p>
+        </w:tc>
+        <w:tc>
+          <w:tcPr/>
+          <w:p>
+            <w:pPr>
+              <w:pStyle w:val="Compact"/>
+            </w:pPr>
+            <w:r>
+              <w:t xml:space="preserve">La page du Studio étranger reste à son écran de connexion dans ce reçu. Le GET Context depuis son origine est public et sans credentials ; il ne prouve aucun outil privé authentifié ou écritures Sanity</w:t>
+            </w:r>
+          </w:p>
+        </w:tc>
+      </w:tr>
+      <w:tr>
+        <w:tc>
+          <w:tcPr/>
+          <w:p>
+            <w:pPr>
+              <w:pStyle w:val="Compact"/>
+            </w:pPr>
+            <w:r>
+              <w:t xml:space="preserve">Preview du Studio étranger authentifié</w:t>
+            </w:r>
+          </w:p>
+        </w:tc>
+        <w:tc>
+          <w:tcPr/>
+          <w:p>
+            <w:pPr>
+              <w:pStyle w:val="Compact"/>
+            </w:pPr>
+            <w:hyperlink r:id="rId144">
+              <w:r>
+                <w:rPr>
+                  <w:rStyle w:val="Hyperlink"/>
+                </w:rPr>
+                <w:t xml:space="preserve">18 contrôles Kaggle/E2B</w:t>
+              </w:r>
+            </w:hyperlink>
+            <w:r>
+              <w:t xml:space="preserve"> </w:t>
+            </w:r>
+            <w:r>
+              <w:t xml:space="preserve">: propriétaire connecté nativement, 25 outils, permissions initiales désactivées, aucun moteur implicite, lectures Context, sauvegarde, reprise et export explicites et un seul artefact synthétique sélectionné dans le preview</w:t>
+            </w:r>
+          </w:p>
+        </w:tc>
+        <w:tc>
+          <w:tcPr/>
+          <w:p>
+            <w:pPr>
+              <w:pStyle w:val="Compact"/>
+            </w:pPr>
+            <w:r>
+              <w:rPr>
+                <w:rStyle w:val="VerbatimChar"/>
+              </w:rPr>
+              <w:t xml:space="preserve">AWAITING_HUMAN_REVIEW_OF_EXACT_PREVIEW</w:t>
+            </w:r>
+            <w:r>
+              <w:t xml:space="preserve">, sans écriture Content Lake. Publication/readback, rejeu, workspace, refus serveur sous un compte en lecture seule et logout restent</w:t>
+            </w:r>
+            <w:r>
+              <w:t xml:space="preserve"> </w:t>
+            </w:r>
+            <w:r>
+              <w:rPr>
+                <w:rStyle w:val="VerbatimChar"/>
+              </w:rPr>
+              <w:t xml:space="preserve">NOT_RUN</w:t>
+            </w:r>
+            <w:r>
+              <w:t xml:space="preserve">. Aucun profil ou token personnel n’est transféré ; les anciens refus et nettoyages restent historiques</w:t>
             </w:r>
           </w:p>
         </w:tc>
@@ -11490,8 +11658,8 @@
         <w:t xml:space="preserve">restent liés à leurs releases et reçus. Une recompilation ne transfère pas automatiquement leur portée à une autre archive.</w:t>
       </w:r>
     </w:p>
-    <w:bookmarkEnd w:id="140"/>
-    <w:bookmarkStart w:id="141" w:name="lire-le-corpus-public-admis"/>
+    <w:bookmarkEnd w:id="145"/>
+    <w:bookmarkStart w:id="146" w:name="lire-le-corpus-public-admis"/>
     <w:p>
       <w:pPr>
         <w:pStyle w:val="Heading2"/>
@@ -11672,8 +11840,8 @@
         <w:t xml:space="preserve">fournit un contenu admissible pour lecture ; elle ne certifie ni sa vérité générale ni la compréhension de l’élève.</w:t>
       </w:r>
     </w:p>
-    <w:bookmarkEnd w:id="141"/>
-    <w:bookmarkStart w:id="142" w:name="X454aafbcb376e33140f0cc0c8b5eecd28758732"/>
+    <w:bookmarkEnd w:id="146"/>
+    <w:bookmarkStart w:id="147" w:name="X454aafbcb376e33140f0cc0c8b5eecd28758732"/>
     <w:p>
       <w:pPr>
         <w:pStyle w:val="Heading2"/>
@@ -11713,8 +11881,8 @@
         <w:t xml:space="preserve">contient les neuf briques inchangées et 46 fichiers de manifeste. La compilation Kaggle conserve son lock et ses entrées sans substituer un corrigé.</w:t>
       </w:r>
     </w:p>
-    <w:bookmarkEnd w:id="142"/>
-    <w:bookmarkStart w:id="144" w:name="documents-et-critères-encore-ouverts"/>
+    <w:bookmarkEnd w:id="147"/>
+    <w:bookmarkStart w:id="151" w:name="documents-et-critères-encore-ouverts"/>
     <w:p>
       <w:pPr>
         <w:pStyle w:val="Heading2"/>
@@ -11733,7 +11901,7 @@
       <w:r>
         <w:t xml:space="preserve"> </w:t>
       </w:r>
-      <w:hyperlink r:id="rId143">
+      <w:hyperlink r:id="rId148">
         <w:r>
           <w:rPr>
             <w:rStyle w:val="Hyperlink"/>
@@ -11750,11 +11918,68 @@
         <w:pStyle w:val="BodyText"/>
       </w:pPr>
       <w:r>
-        <w:t xml:space="preserve">Pour clôturer le Studio hors origine, utiliser ses vrais comptes et droits : monter les outils après authentification, changer de workspace, vérifier la révocation, publier uniquement le contenu sélectionné, constater un refus en lecture seule, puis déconnecter et vérifier les résultats tardifs. Aucun credential personnel n’est copié pour fabriquer cette validation. La revue graphique commune et le prochain tutoriel restent leurs tâches distinctes.</w:t>
-      </w:r>
-    </w:p>
-    <w:bookmarkEnd w:id="144"/>
-    <w:bookmarkStart w:id="145" w:name="Xd1fd05a266d15c22e4102d946e5f852b277b06f"/>
+        <w:t xml:space="preserve">Le registre natif authentifié et le preview sont désormais observés. Pour clôturer les étapes suivantes du Studio hors origine, conserver des reçus distincts : publication du seul payload examiné avec ses vrais droits, readback, rejeu immuable, changement de workspace, refus sous une identité distincte en lecture seule, puis déconnexion et révocation des accès. Ces étapes restent</w:t>
+      </w:r>
+      <w:r>
+        <w:t xml:space="preserve"> </w:t>
+      </w:r>
+      <w:r>
+        <w:rPr>
+          <w:rStyle w:val="VerbatimChar"/>
+        </w:rPr>
+        <w:t xml:space="preserve">NOT_RUN</w:t>
+      </w:r>
+      <w:r>
+        <w:t xml:space="preserve"> </w:t>
+      </w:r>
+      <w:r>
+        <w:t xml:space="preserve">dans le présent point documentaire ; aucun credential personnel ni acquittement humain n’est fabriqué. La revue graphique commune et le prochain tutoriel restent distincts.</w:t>
+      </w:r>
+    </w:p>
+    <w:p>
+      <w:pPr>
+        <w:pStyle w:val="BodyText"/>
+      </w:pPr>
+      <w:r>
+        <w:t xml:space="preserve">Le</w:t>
+      </w:r>
+      <w:r>
+        <w:t xml:space="preserve"> </w:t>
+      </w:r>
+      <w:hyperlink r:id="rId149">
+        <w:r>
+          <w:rPr>
+            <w:rStyle w:val="Hyperlink"/>
+          </w:rPr>
+          <w:t xml:space="preserve">relevé quota du 2 octobre à 00:46 UTC</w:t>
+        </w:r>
+      </w:hyperlink>
+      <w:r>
+        <w:t xml:space="preserve"> </w:t>
+      </w:r>
+      <w:r>
+        <w:t xml:space="preserve">conserve $8,53/$10 quotidiens et $18,29/$100 mensuels, sans renouvellement ni date de recharge observée. Le</w:t>
+      </w:r>
+      <w:r>
+        <w:t xml:space="preserve"> </w:t>
+      </w:r>
+      <w:hyperlink r:id="rId150">
+        <w:r>
+          <w:rPr>
+            <w:rStyle w:val="Hyperlink"/>
+          </w:rPr>
+          <w:t xml:space="preserve">reçu des prérequis C/D/E</w:t>
+        </w:r>
+      </w:hyperlink>
+      <w:r>
+        <w:t xml:space="preserve"> </w:t>
+      </w:r>
+      <w:r>
+        <w:t xml:space="preserve">décrit le gel de C, trois extractions et dix-neuf productions manquantes, sa règle locale de 85 %, le cas technique terminal, la limite réelle de deux KB pour D et le harnais/pool encore requis pour E. Aucune de ces conditions n’est une reprise exécutée ou un score pédagogique. La mission complète reste partielle.</w:t>
+      </w:r>
+    </w:p>
+    <w:bookmarkEnd w:id="151"/>
+    <w:bookmarkStart w:id="152" w:name="Xd1fd05a266d15c22e4102d946e5f852b277b06f"/>
     <w:p>
       <w:pPr>
         <w:pStyle w:val="Heading2"/>
@@ -11781,8 +12006,8 @@
         <w:t xml:space="preserve">Leurs erreurs, refus Context, pages Canva encore absentes et statuts partiels restent des faits historiques. Les résultats actuels figurent ci-dessus ; ils ne changent ni ces champs ni leurs empreintes.</w:t>
       </w:r>
     </w:p>
-    <w:bookmarkEnd w:id="145"/>
-    <w:bookmarkStart w:id="193" w:name="Xa809eccce357b9707b214c7a435d78960d354fe"/>
+    <w:bookmarkEnd w:id="152"/>
+    <w:bookmarkStart w:id="200" w:name="Xa809eccce357b9707b214c7a435d78960d354fe"/>
     <w:p>
       <w:pPr>
         <w:pStyle w:val="Heading2"/>
@@ -11865,7 +12090,7 @@
             <w:r>
               <w:t xml:space="preserve"> </w:t>
             </w:r>
-            <w:hyperlink r:id="rId146">
+            <w:hyperlink r:id="rId153">
               <w:r>
                 <w:rPr>
                   <w:rStyle w:val="Hyperlink"/>
@@ -11908,7 +12133,7 @@
             <w:r>
               <w:t xml:space="preserve"> </w:t>
             </w:r>
-            <w:hyperlink r:id="rId147">
+            <w:hyperlink r:id="rId154">
               <w:r>
                 <w:rPr>
                   <w:rStyle w:val="Hyperlink"/>
@@ -11937,7 +12162,7 @@
             <w:pPr>
               <w:pStyle w:val="Compact"/>
             </w:pPr>
-            <w:hyperlink r:id="rId148">
+            <w:hyperlink r:id="rId155">
               <w:r>
                 <w:rPr>
                   <w:rStyle w:val="Hyperlink"/>
@@ -11951,7 +12176,7 @@
             <w:r>
               <w:t xml:space="preserve"> </w:t>
             </w:r>
-            <w:hyperlink r:id="rId149">
+            <w:hyperlink r:id="rId156">
               <w:r>
                 <w:rPr>
                   <w:rStyle w:val="Hyperlink"/>
@@ -12003,7 +12228,7 @@
             <w:pPr>
               <w:pStyle w:val="Compact"/>
             </w:pPr>
-            <w:hyperlink r:id="rId150">
+            <w:hyperlink r:id="rId157">
               <w:r>
                 <w:rPr>
                   <w:rStyle w:val="Hyperlink"/>
@@ -12055,7 +12280,7 @@
             <w:pPr>
               <w:pStyle w:val="Compact"/>
             </w:pPr>
-            <w:hyperlink r:id="rId151">
+            <w:hyperlink r:id="rId158">
               <w:r>
                 <w:rPr>
                   <w:rStyle w:val="Hyperlink"/>
@@ -12072,7 +12297,7 @@
             <w:r>
               <w:t xml:space="preserve"> </w:t>
             </w:r>
-            <w:hyperlink r:id="rId152">
+            <w:hyperlink r:id="rId159">
               <w:r>
                 <w:rPr>
                   <w:rStyle w:val="Hyperlink"/>
@@ -12130,7 +12355,7 @@
             <w:pPr>
               <w:pStyle w:val="Compact"/>
             </w:pPr>
-            <w:hyperlink r:id="rId153">
+            <w:hyperlink r:id="rId160">
               <w:r>
                 <w:rPr>
                   <w:rStyle w:val="Hyperlink"/>
@@ -12147,7 +12372,7 @@
             <w:r>
               <w:t xml:space="preserve"> </w:t>
             </w:r>
-            <w:hyperlink r:id="rId154">
+            <w:hyperlink r:id="rId161">
               <w:r>
                 <w:rPr>
                   <w:rStyle w:val="Hyperlink"/>
@@ -12220,7 +12445,7 @@
             <w:r>
               <w:t xml:space="preserve"> </w:t>
             </w:r>
-            <w:hyperlink r:id="rId155">
+            <w:hyperlink r:id="rId162">
               <w:r>
                 <w:rPr>
                   <w:rStyle w:val="Hyperlink"/>
@@ -12260,7 +12485,7 @@
             <w:pPr>
               <w:pStyle w:val="Compact"/>
             </w:pPr>
-            <w:hyperlink r:id="rId156">
+            <w:hyperlink r:id="rId163">
               <w:r>
                 <w:rPr>
                   <w:rStyle w:val="Hyperlink"/>
@@ -12315,7 +12540,7 @@
             <w:pPr>
               <w:pStyle w:val="Compact"/>
             </w:pPr>
-            <w:hyperlink r:id="rId157">
+            <w:hyperlink r:id="rId164">
               <w:r>
                 <w:rPr>
                   <w:rStyle w:val="Hyperlink"/>
@@ -12475,7 +12700,7 @@
             <w:pPr>
               <w:pStyle w:val="Compact"/>
             </w:pPr>
-            <w:hyperlink r:id="rId158">
+            <w:hyperlink r:id="rId165">
               <w:r>
                 <w:rPr>
                   <w:rStyle w:val="Hyperlink"/>
@@ -12550,7 +12775,7 @@
             <w:pPr>
               <w:pStyle w:val="Compact"/>
             </w:pPr>
-            <w:hyperlink r:id="rId159">
+            <w:hyperlink r:id="rId166">
               <w:r>
                 <w:rPr>
                   <w:rStyle w:val="Hyperlink"/>
@@ -12605,7 +12830,7 @@
             <w:pPr>
               <w:pStyle w:val="Compact"/>
             </w:pPr>
-            <w:hyperlink r:id="rId160">
+            <w:hyperlink r:id="rId167">
               <w:r>
                 <w:rPr>
                   <w:rStyle w:val="Hyperlink"/>
@@ -12678,7 +12903,7 @@
             <w:pPr>
               <w:pStyle w:val="Compact"/>
             </w:pPr>
-            <w:hyperlink r:id="rId161">
+            <w:hyperlink r:id="rId168">
               <w:r>
                 <w:rPr>
                   <w:rStyle w:val="Hyperlink"/>
@@ -12745,7 +12970,7 @@
             <w:pPr>
               <w:pStyle w:val="Compact"/>
             </w:pPr>
-            <w:hyperlink r:id="rId162">
+            <w:hyperlink r:id="rId169">
               <w:r>
                 <w:rPr>
                   <w:rStyle w:val="Hyperlink"/>
@@ -12806,7 +13031,7 @@
             <w:pPr>
               <w:pStyle w:val="Compact"/>
             </w:pPr>
-            <w:hyperlink r:id="rId163">
+            <w:hyperlink r:id="rId170">
               <w:r>
                 <w:rPr>
                   <w:rStyle w:val="Hyperlink"/>
@@ -12820,7 +13045,7 @@
             <w:r>
               <w:t xml:space="preserve"> </w:t>
             </w:r>
-            <w:hyperlink r:id="rId164">
+            <w:hyperlink r:id="rId171">
               <w:r>
                 <w:rPr>
                   <w:rStyle w:val="Hyperlink"/>
@@ -12834,7 +13059,7 @@
             <w:r>
               <w:t xml:space="preserve"> </w:t>
             </w:r>
-            <w:hyperlink r:id="rId165">
+            <w:hyperlink r:id="rId172">
               <w:r>
                 <w:rPr>
                   <w:rStyle w:val="Hyperlink"/>
@@ -12880,7 +13105,7 @@
             <w:pPr>
               <w:pStyle w:val="Compact"/>
             </w:pPr>
-            <w:hyperlink r:id="rId166">
+            <w:hyperlink r:id="rId173">
               <w:r>
                 <w:rPr>
                   <w:rStyle w:val="Hyperlink"/>
@@ -12897,7 +13122,7 @@
             <w:r>
               <w:t xml:space="preserve"> </w:t>
             </w:r>
-            <w:hyperlink r:id="rId167">
+            <w:hyperlink r:id="rId174">
               <w:r>
                 <w:rPr>
                   <w:rStyle w:val="Hyperlink"/>
@@ -12964,7 +13189,7 @@
             <w:pPr>
               <w:pStyle w:val="Compact"/>
             </w:pPr>
-            <w:hyperlink r:id="rId168">
+            <w:hyperlink r:id="rId175">
               <w:r>
                 <w:rPr>
                   <w:rStyle w:val="Hyperlink"/>
@@ -12978,7 +13203,7 @@
             <w:r>
               <w:t xml:space="preserve"> </w:t>
             </w:r>
-            <w:hyperlink r:id="rId169">
+            <w:hyperlink r:id="rId176">
               <w:r>
                 <w:rPr>
                   <w:rStyle w:val="Hyperlink"/>
@@ -12995,7 +13220,7 @@
             <w:r>
               <w:t xml:space="preserve"> </w:t>
             </w:r>
-            <w:hyperlink r:id="rId170">
+            <w:hyperlink r:id="rId177">
               <w:r>
                 <w:rPr>
                   <w:rStyle w:val="Hyperlink"/>
@@ -13041,7 +13266,7 @@
             <w:pPr>
               <w:pStyle w:val="Compact"/>
             </w:pPr>
-            <w:hyperlink r:id="rId171">
+            <w:hyperlink r:id="rId178">
               <w:r>
                 <w:rPr>
                   <w:rStyle w:val="Hyperlink"/>
@@ -13073,7 +13298,7 @@
             <w:r>
               <w:t xml:space="preserve"> </w:t>
             </w:r>
-            <w:hyperlink r:id="rId172">
+            <w:hyperlink r:id="rId179">
               <w:r>
                 <w:rPr>
                   <w:rStyle w:val="Hyperlink"/>
@@ -13176,7 +13401,7 @@
             <w:r>
               <w:t xml:space="preserve"> </w:t>
             </w:r>
-            <w:hyperlink r:id="rId170">
+            <w:hyperlink r:id="rId177">
               <w:r>
                 <w:rPr>
                   <w:rStyle w:val="Hyperlink"/>
@@ -13228,7 +13453,7 @@
             <w:pPr>
               <w:pStyle w:val="Compact"/>
             </w:pPr>
-            <w:hyperlink r:id="rId173">
+            <w:hyperlink r:id="rId180">
               <w:r>
                 <w:rPr>
                   <w:rStyle w:val="Hyperlink"/>
@@ -13298,7 +13523,7 @@
             <w:pPr>
               <w:pStyle w:val="Compact"/>
             </w:pPr>
-            <w:hyperlink r:id="rId174">
+            <w:hyperlink r:id="rId181">
               <w:r>
                 <w:rPr>
                   <w:rStyle w:val="Hyperlink"/>
@@ -13386,7 +13611,7 @@
             <w:pPr>
               <w:pStyle w:val="Compact"/>
             </w:pPr>
-            <w:hyperlink r:id="rId175">
+            <w:hyperlink r:id="rId182">
               <w:r>
                 <w:rPr>
                   <w:rStyle w:val="Hyperlink"/>
@@ -13400,7 +13625,7 @@
             <w:r>
               <w:t xml:space="preserve"> </w:t>
             </w:r>
-            <w:hyperlink r:id="rId176">
+            <w:hyperlink r:id="rId183">
               <w:r>
                 <w:rPr>
                   <w:rStyle w:val="Hyperlink"/>
@@ -13500,7 +13725,7 @@
             <w:r>
               <w:t xml:space="preserve"> </w:t>
             </w:r>
-            <w:hyperlink r:id="rId177">
+            <w:hyperlink r:id="rId184">
               <w:r>
                 <w:rPr>
                   <w:rStyle w:val="Hyperlink"/>
@@ -13570,7 +13795,7 @@
             <w:pPr>
               <w:pStyle w:val="Compact"/>
             </w:pPr>
-            <w:hyperlink r:id="rId178">
+            <w:hyperlink r:id="rId185">
               <w:r>
                 <w:rPr>
                   <w:rStyle w:val="Hyperlink"/>
@@ -13652,7 +13877,7 @@
             <w:pPr>
               <w:pStyle w:val="Compact"/>
             </w:pPr>
-            <w:hyperlink r:id="rId179">
+            <w:hyperlink r:id="rId186">
               <w:r>
                 <w:rPr>
                   <w:rStyle w:val="Hyperlink"/>
@@ -13710,7 +13935,7 @@
             <w:pPr>
               <w:pStyle w:val="Compact"/>
             </w:pPr>
-            <w:hyperlink r:id="rId180">
+            <w:hyperlink r:id="rId187">
               <w:r>
                 <w:rPr>
                   <w:rStyle w:val="Hyperlink"/>
@@ -13783,7 +14008,7 @@
             <w:pPr>
               <w:pStyle w:val="Compact"/>
             </w:pPr>
-            <w:hyperlink r:id="rId181">
+            <w:hyperlink r:id="rId188">
               <w:r>
                 <w:rPr>
                   <w:rStyle w:val="Hyperlink"/>
@@ -13871,7 +14096,7 @@
             <w:pPr>
               <w:pStyle w:val="Compact"/>
             </w:pPr>
-            <w:hyperlink r:id="rId182">
+            <w:hyperlink r:id="rId189">
               <w:r>
                 <w:rPr>
                   <w:rStyle w:val="Hyperlink"/>
@@ -13938,7 +14163,7 @@
             <w:pPr>
               <w:pStyle w:val="Compact"/>
             </w:pPr>
-            <w:hyperlink r:id="rId183">
+            <w:hyperlink r:id="rId190">
               <w:r>
                 <w:rPr>
                   <w:rStyle w:val="Hyperlink"/>
@@ -14005,7 +14230,7 @@
             <w:pPr>
               <w:pStyle w:val="Compact"/>
             </w:pPr>
-            <w:hyperlink r:id="rId184">
+            <w:hyperlink r:id="rId191">
               <w:r>
                 <w:rPr>
                   <w:rStyle w:val="Hyperlink"/>
@@ -14022,7 +14247,7 @@
             <w:r>
               <w:t xml:space="preserve"> </w:t>
             </w:r>
-            <w:hyperlink r:id="rId185">
+            <w:hyperlink r:id="rId192">
               <w:r>
                 <w:rPr>
                   <w:rStyle w:val="Hyperlink"/>
@@ -14074,7 +14299,7 @@
             <w:pPr>
               <w:pStyle w:val="Compact"/>
             </w:pPr>
-            <w:hyperlink r:id="rId186">
+            <w:hyperlink r:id="rId193">
               <w:r>
                 <w:rPr>
                   <w:rStyle w:val="Hyperlink"/>
@@ -14129,7 +14354,7 @@
             <w:pPr>
               <w:pStyle w:val="Compact"/>
             </w:pPr>
-            <w:hyperlink r:id="rId187">
+            <w:hyperlink r:id="rId194">
               <w:r>
                 <w:rPr>
                   <w:rStyle w:val="Hyperlink"/>
@@ -14146,7 +14371,7 @@
             <w:r>
               <w:t xml:space="preserve"> </w:t>
             </w:r>
-            <w:hyperlink r:id="rId188">
+            <w:hyperlink r:id="rId195">
               <w:r>
                 <w:rPr>
                   <w:rStyle w:val="Hyperlink"/>
@@ -14243,7 +14468,7 @@
             <w:r>
               <w:t xml:space="preserve"> </w:t>
             </w:r>
-            <w:hyperlink r:id="rId189">
+            <w:hyperlink r:id="rId196">
               <w:r>
                 <w:rPr>
                   <w:rStyle w:val="Hyperlink"/>
@@ -14451,7 +14676,7 @@
             <w:r>
               <w:t xml:space="preserve"> </w:t>
             </w:r>
-            <w:hyperlink r:id="rId183">
+            <w:hyperlink r:id="rId190">
               <w:r>
                 <w:rPr>
                   <w:rStyle w:val="Hyperlink"/>
@@ -14497,7 +14722,7 @@
             <w:pPr>
               <w:pStyle w:val="Compact"/>
             </w:pPr>
-            <w:hyperlink r:id="rId190">
+            <w:hyperlink r:id="rId197">
               <w:r>
                 <w:rPr>
                   <w:rStyle w:val="Hyperlink"/>
@@ -14624,7 +14849,7 @@
             <w:pPr>
               <w:pStyle w:val="Compact"/>
             </w:pPr>
-            <w:hyperlink r:id="rId191">
+            <w:hyperlink r:id="rId198">
               <w:r>
                 <w:rPr>
                   <w:rStyle w:val="Hyperlink"/>
@@ -14792,7 +15017,7 @@
             <w:pPr>
               <w:pStyle w:val="Compact"/>
             </w:pPr>
-            <w:hyperlink r:id="rId192">
+            <w:hyperlink r:id="rId199">
               <w:r>
                 <w:rPr>
                   <w:rStyle w:val="Hyperlink"/>
@@ -15030,8 +15255,8 @@
         <w:t xml:space="preserve">sans modifier ses champs, ni attribuer le succès au dialogue d’import manuel indisponible.</w:t>
       </w:r>
     </w:p>
-    <w:bookmarkEnd w:id="193"/>
-    <w:bookmarkStart w:id="194" w:name="X529e46fd6e5537718cd34edc0406fd6e7eaeff6"/>
+    <w:bookmarkEnd w:id="200"/>
+    <w:bookmarkStart w:id="201" w:name="X529e46fd6e5537718cd34edc0406fd6e7eaeff6"/>
     <w:p>
       <w:pPr>
         <w:pStyle w:val="Heading2"/>
@@ -15141,8 +15366,8 @@
         <w:t xml:space="preserve">au relâchement. Le geste pointeur lance réellement l’objet ; le rebond et le gel de position/vitesse ont été observés. Son export téléchargé reste une fixture de QA opérée par Codex, séparée du corrigé et d’une production d’élève.</w:t>
       </w:r>
     </w:p>
-    <w:bookmarkEnd w:id="194"/>
-    <w:bookmarkStart w:id="195" w:name="X0fec82641f27383aad2fab960f6219be6d020c7"/>
+    <w:bookmarkEnd w:id="201"/>
+    <w:bookmarkStart w:id="202" w:name="X0fec82641f27383aad2fab960f6219be6d020c7"/>
     <w:p>
       <w:pPr>
         <w:pStyle w:val="Heading2"/>
@@ -15276,8 +15501,8 @@
         <w:t xml:space="preserve">est observé. Ces résultats concernent l’historique interne de la copie Colab, distinct du véritable retour du projet Astro.</w:t>
       </w:r>
     </w:p>
-    <w:bookmarkEnd w:id="195"/>
-    <w:bookmarkStart w:id="196" w:name="X1f863a60b9108efd5646f890a88937dd9c7ed11"/>
+    <w:bookmarkEnd w:id="202"/>
+    <w:bookmarkStart w:id="203" w:name="X1f863a60b9108efd5646f890a88937dd9c7ed11"/>
     <w:p>
       <w:pPr>
         <w:pStyle w:val="Heading2"/>
@@ -15347,8 +15572,8 @@
         <w:t xml:space="preserve">restent dans la chronologie ; aucune vérification n’est attribuée rétroactivement à cet artefact. L’empreinte du manifeste Git HTTP et celle de la copie Windows CRLF sont distinctes et identifiées dans le reçu Colab ; les assertions de contenu ont été conservées.</w:t>
       </w:r>
     </w:p>
-    <w:bookmarkEnd w:id="196"/>
-    <w:bookmarkStart w:id="198" w:name="X48464ab64d23050dd21ecb9905a13201698a496"/>
+    <w:bookmarkEnd w:id="203"/>
+    <w:bookmarkStart w:id="205" w:name="X48464ab64d23050dd21ecb9905a13201698a496"/>
     <w:p>
       <w:pPr>
         <w:pStyle w:val="Heading2"/>
@@ -15375,7 +15600,7 @@
       <w:r>
         <w:t xml:space="preserve"> </w:t>
       </w:r>
-      <w:hyperlink r:id="rId197">
+      <w:hyperlink r:id="rId204">
         <w:r>
           <w:rPr>
             <w:rStyle w:val="Hyperlink"/>
@@ -15390,8 +15615,8 @@
         <w:t xml:space="preserve">distingue versions déclarées, exécutions observées et outils d’export encore à qualifier.</w:t>
       </w:r>
     </w:p>
-    <w:bookmarkEnd w:id="198"/>
-    <w:bookmarkStart w:id="199" w:name="X9371704e78fc7b033657b1707e9feda31618b08"/>
+    <w:bookmarkEnd w:id="205"/>
+    <w:bookmarkStart w:id="206" w:name="X9371704e78fc7b033657b1707e9feda31618b08"/>
     <w:p>
       <w:pPr>
         <w:pStyle w:val="Heading2"/>
@@ -15455,9 +15680,9 @@
         <w:t xml:space="preserve">; cette réponse est validée par les régressions serveur et par le reçu de production qui garde ses observations HTTP. La reprise exige des références admissibles couvrant les huit modules et le protocole, puis la validation d’une lecture du corpus effectivement admis.</w:t>
       </w:r>
     </w:p>
-    <w:bookmarkEnd w:id="199"/>
-    <w:bookmarkEnd w:id="200"/>
-    <w:bookmarkStart w:id="206" w:name="partie-ii-accompagner-et-enseigner"/>
+    <w:bookmarkEnd w:id="206"/>
+    <w:bookmarkEnd w:id="207"/>
+    <w:bookmarkStart w:id="213" w:name="partie-ii-accompagner-et-enseigner"/>
     <w:p>
       <w:pPr>
         <w:pStyle w:val="Heading1"/>
@@ -15474,7 +15699,7 @@
         <w:t xml:space="preserve">Cette partie prépare l’enseignant à partir du travail sélectionné par l’élève. Les corrigés donnent des pistes de raisonnement ; l’enseignant compare ces pistes au scénario et à l’explication effectivement présentés. Les scripts sont des propositions de parole pour Jean-Sébastien, avec des pauses et intonations suggérées.</w:t>
       </w:r>
     </w:p>
-    <w:bookmarkStart w:id="201" w:name="préparer-une-séance"/>
+    <w:bookmarkStart w:id="208" w:name="préparer-une-séance"/>
     <w:p>
       <w:pPr>
         <w:pStyle w:val="Heading2"/>
@@ -15499,8 +15724,8 @@
         <w:t xml:space="preserve">Pendant la séance, montrer un effet, laisser une prédiction, relier une donnée au code et faire essayer une modification. La question finale change le contexte afin d’examiner le transfert. L’assistant reste disponible pour expliquer ; l’élève garde la décision et montre ce qu’il retient.</w:t>
       </w:r>
     </w:p>
-    <w:bookmarkEnd w:id="201"/>
-    <w:bookmarkStart w:id="202" w:name="examiner-sans-confondre-les-preuves"/>
+    <w:bookmarkEnd w:id="208"/>
+    <w:bookmarkStart w:id="209" w:name="examiner-sans-confondre-les-preuves"/>
     <w:p>
       <w:pPr>
         <w:pStyle w:val="Heading2"/>
@@ -15791,8 +16016,8 @@
         <w:t xml:space="preserve">. Une réussite locale ne devient pas une maîtrise universelle. T/I/F porte sur les preuves d’une affirmation ; il ne devient pas une note d’élève.</w:t>
       </w:r>
     </w:p>
-    <w:bookmarkEnd w:id="202"/>
-    <w:bookmarkStart w:id="203" w:name="intervenir-à-partir-dune-difficulté"/>
+    <w:bookmarkEnd w:id="209"/>
+    <w:bookmarkStart w:id="210" w:name="intervenir-à-partir-dune-difficulté"/>
     <w:p>
       <w:pPr>
         <w:pStyle w:val="Heading2"/>
@@ -16000,8 +16225,8 @@
         <w:t xml:space="preserve">Pour chaque revue, conserver le scénario examiné, l’explication, la limite, l’aide déclarée, le transfert et la suite choisie. Le retour de l’assistant et la décision humaine restent séparés. Les fiches détachables reprennent ce cadre pour pouvoir circuler sans le manuel complet.</w:t>
       </w:r>
     </w:p>
-    <w:bookmarkEnd w:id="203"/>
-    <w:bookmarkStart w:id="204" w:name="choisir-laide"/>
+    <w:bookmarkEnd w:id="210"/>
+    <w:bookmarkStart w:id="211" w:name="choisir-laide"/>
     <w:p>
       <w:pPr>
         <w:pStyle w:val="Heading2"/>
@@ -16018,8 +16243,8 @@
         <w:t xml:space="preserve">L’élève peut demander un indice conceptuel, un indice technique, du pseudo-code, un exemple partiel, une solution complète ou son explication. Après une solution complète, proposer une vérification et un changement de contexte. Le niveau d’aide reçu est déclaré avec la production ; il ne sert pas à disqualifier automatiquement l’apprentissage.</w:t>
       </w:r>
     </w:p>
-    <w:bookmarkEnd w:id="204"/>
-    <w:bookmarkStart w:id="205" w:name="préparer-laccessibilité"/>
+    <w:bookmarkEnd w:id="211"/>
+    <w:bookmarkStart w:id="212" w:name="préparer-laccessibilité"/>
     <w:p>
       <w:pPr>
         <w:pStyle w:val="Heading2"/>
@@ -16036,9 +16261,9 @@
         <w:t xml:space="preserve">Conserver la liste HTML, les libellés et le clavier. Le mode statique garde l’image courante et suspend son évolution. L’alternative accessible garde le contenu lorsque WebGL ou le réseau sont indisponibles. Contraste, texte agrandi et langue améliorent le parcours ; le code personnel n’est pas traduit automatiquement.</w:t>
       </w:r>
     </w:p>
-    <w:bookmarkEnd w:id="205"/>
-    <w:bookmarkEnd w:id="206"/>
-    <w:bookmarkStart w:id="213" w:name="fiche-enseignant-1-geste-état-et-rendu"/>
+    <w:bookmarkEnd w:id="212"/>
+    <w:bookmarkEnd w:id="213"/>
+    <w:bookmarkStart w:id="220" w:name="fiche-enseignant-1-geste-état-et-rendu"/>
     <w:p>
       <w:pPr>
         <w:pStyle w:val="Heading1"/>
@@ -16099,7 +16324,7 @@
       <w:r>
         <w:t xml:space="preserve"> </w:t>
       </w:r>
-      <w:hyperlink r:id="rId207">
+      <w:hyperlink r:id="rId214">
         <w:r>
           <w:rPr>
             <w:rStyle w:val="Hyperlink"/>
@@ -16114,7 +16339,7 @@
         <w:t xml:space="preserve">est une piste à examiner après la tentative. Retrouver la prédiction et la version réellement choisie avant de comparer.</w:t>
       </w:r>
     </w:p>
-    <w:bookmarkStart w:id="208" w:name="X0cfd65b8a8cbd29bb90a2abf03ee880dab26982"/>
+    <w:bookmarkStart w:id="215" w:name="X0cfd65b8a8cbd29bb90a2abf03ee880dab26982"/>
     <w:p>
       <w:pPr>
         <w:pStyle w:val="Heading2"/>
@@ -16196,8 +16421,8 @@
         <w:t xml:space="preserve">.</w:t>
       </w:r>
     </w:p>
-    <w:bookmarkEnd w:id="208"/>
-    <w:bookmarkStart w:id="210" w:name="déroulé-et-script-de-séance"/>
+    <w:bookmarkEnd w:id="215"/>
+    <w:bookmarkStart w:id="217" w:name="déroulé-et-script-de-séance"/>
     <w:p>
       <w:pPr>
         <w:pStyle w:val="Heading2"/>
@@ -16341,7 +16566,7 @@
         </w:tc>
       </w:tr>
     </w:tbl>
-    <w:bookmarkStart w:id="209" w:name="script-enseignant-séquence-de-5-minutes"/>
+    <w:bookmarkStart w:id="216" w:name="script-enseignant-séquence-de-5-minutes"/>
     <w:p>
       <w:pPr>
         <w:pStyle w:val="Heading3"/>
@@ -16500,9 +16725,9 @@
         <w:t xml:space="preserve">« Si cette sphère devient une carte de ton site, quelle donnée gardes-tu ? Et si le geste s’interrompt, comment éviter une carte qui reste accrochée ? » Accepter texte, dessin ou code annoté. Si l’explication manque, revenir à un seul événement plutôt que conclure à une maîtrise acquise.</w:t>
       </w:r>
     </w:p>
-    <w:bookmarkEnd w:id="209"/>
-    <w:bookmarkEnd w:id="210"/>
-    <w:bookmarkStart w:id="211" w:name="repérer-et-travailler-une-difficulté"/>
+    <w:bookmarkEnd w:id="216"/>
+    <w:bookmarkEnd w:id="217"/>
+    <w:bookmarkStart w:id="218" w:name="repérer-et-travailler-une-difficulté"/>
     <w:p>
       <w:pPr>
         <w:pStyle w:val="Heading2"/>
@@ -16555,8 +16780,8 @@
         <w:t xml:space="preserve">et appliquer le cadre d’intervention commun à cette difficulté.</w:t>
       </w:r>
     </w:p>
-    <w:bookmarkEnd w:id="211"/>
-    <w:bookmarkStart w:id="212" w:name="transfert-et-retour-humain"/>
+    <w:bookmarkEnd w:id="218"/>
+    <w:bookmarkStart w:id="219" w:name="transfert-et-retour-humain"/>
     <w:p>
       <w:pPr>
         <w:pStyle w:val="Heading2"/>
@@ -16586,9 +16811,9 @@
         <w:t xml:space="preserve">. L’élève peut répondre par texte, schéma ou code annoté, puis essayer la proposition. Relier le retour humain au scénario de transfert effectivement examiné.</w:t>
       </w:r>
     </w:p>
-    <w:bookmarkEnd w:id="212"/>
-    <w:bookmarkEnd w:id="213"/>
-    <w:bookmarkStart w:id="220" w:name="fiche-enseignant-2-organisation-astro"/>
+    <w:bookmarkEnd w:id="219"/>
+    <w:bookmarkEnd w:id="220"/>
+    <w:bookmarkStart w:id="227" w:name="fiche-enseignant-2-organisation-astro"/>
     <w:p>
       <w:pPr>
         <w:pStyle w:val="Heading1"/>
@@ -16649,7 +16874,7 @@
       <w:r>
         <w:t xml:space="preserve"> </w:t>
       </w:r>
-      <w:hyperlink r:id="rId214">
+      <w:hyperlink r:id="rId221">
         <w:r>
           <w:rPr>
             <w:rStyle w:val="Hyperlink"/>
@@ -16664,7 +16889,7 @@
         <w:t xml:space="preserve">est une piste à examiner après la tentative. Retrouver la prédiction et la version réellement choisie avant de comparer.</w:t>
       </w:r>
     </w:p>
-    <w:bookmarkStart w:id="215" w:name="X35eadf8a2b302f353d54fbae31581cec31af452"/>
+    <w:bookmarkStart w:id="222" w:name="X35eadf8a2b302f353d54fbae31581cec31af452"/>
     <w:p>
       <w:pPr>
         <w:pStyle w:val="Heading2"/>
@@ -16746,8 +16971,8 @@
         <w:t xml:space="preserve">.</w:t>
       </w:r>
     </w:p>
-    <w:bookmarkEnd w:id="215"/>
-    <w:bookmarkStart w:id="217" w:name="déroulé-et-script-de-séance-1"/>
+    <w:bookmarkEnd w:id="222"/>
+    <w:bookmarkStart w:id="224" w:name="déroulé-et-script-de-séance-1"/>
     <w:p>
       <w:pPr>
         <w:pStyle w:val="Heading2"/>
@@ -16891,7 +17116,7 @@
         </w:tc>
       </w:tr>
     </w:tbl>
-    <w:bookmarkStart w:id="216" w:name="X555804bff3b99380e77f00f007d375e9dee883c"/>
+    <w:bookmarkStart w:id="223" w:name="X555804bff3b99380e77f00f007d375e9dee883c"/>
     <w:p>
       <w:pPr>
         <w:pStyle w:val="Heading3"/>
@@ -17038,9 +17263,9 @@
         <w:t xml:space="preserve">« Imagine une carte pour trois livres ou trois activités. Quelles données changes-tu ? Quelle logique peux-tu garder ? » Laisser annoter trois modifications puis expliquer la partie conservée. La répétition d’une phrase du cours ne suffit pas : l’élève doit montrer son nouveau contenu.</w:t>
       </w:r>
     </w:p>
-    <w:bookmarkEnd w:id="216"/>
-    <w:bookmarkEnd w:id="217"/>
-    <w:bookmarkStart w:id="218" w:name="repérer-et-travailler-une-difficulté-1"/>
+    <w:bookmarkEnd w:id="223"/>
+    <w:bookmarkEnd w:id="224"/>
+    <w:bookmarkStart w:id="225" w:name="repérer-et-travailler-une-difficulté-1"/>
     <w:p>
       <w:pPr>
         <w:pStyle w:val="Heading2"/>
@@ -17093,8 +17318,8 @@
         <w:t xml:space="preserve">et appliquer le cadre d’intervention commun à cette difficulté.</w:t>
       </w:r>
     </w:p>
-    <w:bookmarkEnd w:id="218"/>
-    <w:bookmarkStart w:id="219" w:name="transfert-et-retour-humain-1"/>
+    <w:bookmarkEnd w:id="225"/>
+    <w:bookmarkStart w:id="226" w:name="transfert-et-retour-humain-1"/>
     <w:p>
       <w:pPr>
         <w:pStyle w:val="Heading2"/>
@@ -17124,9 +17349,9 @@
         <w:t xml:space="preserve">. L’élève peut répondre par texte, schéma ou code annoté, puis essayer la proposition. Relier le retour humain au scénario de transfert effectivement examiné.</w:t>
       </w:r>
     </w:p>
-    <w:bookmarkEnd w:id="219"/>
-    <w:bookmarkEnd w:id="220"/>
-    <w:bookmarkStart w:id="227" w:name="Xda7ebd33fdfb1099a75cab4fd4a90e5955e6842"/>
+    <w:bookmarkEnd w:id="226"/>
+    <w:bookmarkEnd w:id="227"/>
+    <w:bookmarkStart w:id="234" w:name="Xda7ebd33fdfb1099a75cab4fd4a90e5955e6842"/>
     <w:p>
       <w:pPr>
         <w:pStyle w:val="Heading1"/>
@@ -17187,7 +17412,7 @@
       <w:r>
         <w:t xml:space="preserve"> </w:t>
       </w:r>
-      <w:hyperlink r:id="rId221">
+      <w:hyperlink r:id="rId228">
         <w:r>
           <w:rPr>
             <w:rStyle w:val="Hyperlink"/>
@@ -17202,7 +17427,7 @@
         <w:t xml:space="preserve">est une piste à examiner après la tentative. Retrouver la prédiction et la version réellement choisie avant de comparer.</w:t>
       </w:r>
     </w:p>
-    <w:bookmarkStart w:id="222" w:name="Xa6aba97eefe55e6606eb3f5fa7db158eaf6362b"/>
+    <w:bookmarkStart w:id="229" w:name="Xa6aba97eefe55e6606eb3f5fa7db158eaf6362b"/>
     <w:p>
       <w:pPr>
         <w:pStyle w:val="Heading2"/>
@@ -17284,8 +17509,8 @@
         <w:t xml:space="preserve">.</w:t>
       </w:r>
     </w:p>
-    <w:bookmarkEnd w:id="222"/>
-    <w:bookmarkStart w:id="224" w:name="déroulé-et-script-de-séance-2"/>
+    <w:bookmarkEnd w:id="229"/>
+    <w:bookmarkStart w:id="231" w:name="déroulé-et-script-de-séance-2"/>
     <w:p>
       <w:pPr>
         <w:pStyle w:val="Heading2"/>
@@ -17429,7 +17654,7 @@
         </w:tc>
       </w:tr>
     </w:tbl>
-    <w:bookmarkStart w:id="223" w:name="Xc888f2859c02c544cad64db99b082e0250e20e2"/>
+    <w:bookmarkStart w:id="230" w:name="Xc888f2859c02c544cad64db99b082e0250e20e2"/>
     <w:p>
       <w:pPr>
         <w:pStyle w:val="Heading3"/>
@@ -17549,9 +17774,9 @@
         <w:t xml:space="preserve">« Pour ton projet, pourrais-tu présenter trois étapes dans une scène et dans une liste ? Quelle donnée doit rester commune ? » Laisser dessiner un exemple. Demander une justification de l’intérêt de la 3D et conserver la question si cet intérêt reste incertain.</w:t>
       </w:r>
     </w:p>
-    <w:bookmarkEnd w:id="223"/>
-    <w:bookmarkEnd w:id="224"/>
-    <w:bookmarkStart w:id="225" w:name="repérer-et-travailler-une-difficulté-2"/>
+    <w:bookmarkEnd w:id="230"/>
+    <w:bookmarkEnd w:id="231"/>
+    <w:bookmarkStart w:id="232" w:name="repérer-et-travailler-une-difficulté-2"/>
     <w:p>
       <w:pPr>
         <w:pStyle w:val="Heading2"/>
@@ -17604,8 +17829,8 @@
         <w:t xml:space="preserve">et appliquer le cadre d’intervention commun à cette difficulté.</w:t>
       </w:r>
     </w:p>
-    <w:bookmarkEnd w:id="225"/>
-    <w:bookmarkStart w:id="226" w:name="transfert-et-retour-humain-2"/>
+    <w:bookmarkEnd w:id="232"/>
+    <w:bookmarkStart w:id="233" w:name="transfert-et-retour-humain-2"/>
     <w:p>
       <w:pPr>
         <w:pStyle w:val="Heading2"/>
@@ -17635,9 +17860,9 @@
         <w:t xml:space="preserve">. L’élève peut répondre par texte, schéma ou code annoté, puis essayer la proposition. Relier le retour humain au scénario de transfert effectivement examiné.</w:t>
       </w:r>
     </w:p>
-    <w:bookmarkEnd w:id="226"/>
-    <w:bookmarkEnd w:id="227"/>
-    <w:bookmarkStart w:id="234" w:name="fiche-enseignant-4-vitesse-et-inertie"/>
+    <w:bookmarkEnd w:id="233"/>
+    <w:bookmarkEnd w:id="234"/>
+    <w:bookmarkStart w:id="241" w:name="fiche-enseignant-4-vitesse-et-inertie"/>
     <w:p>
       <w:pPr>
         <w:pStyle w:val="Heading1"/>
@@ -17698,7 +17923,7 @@
       <w:r>
         <w:t xml:space="preserve"> </w:t>
       </w:r>
-      <w:hyperlink r:id="rId228">
+      <w:hyperlink r:id="rId235">
         <w:r>
           <w:rPr>
             <w:rStyle w:val="Hyperlink"/>
@@ -17713,7 +17938,7 @@
         <w:t xml:space="preserve">est une piste à examiner après la tentative. Retrouver la prédiction et la version réellement choisie avant de comparer.</w:t>
       </w:r>
     </w:p>
-    <w:bookmarkStart w:id="229" w:name="X5142deb78e7c20014215c468e28e00460c24920"/>
+    <w:bookmarkStart w:id="236" w:name="X5142deb78e7c20014215c468e28e00460c24920"/>
     <w:p>
       <w:pPr>
         <w:pStyle w:val="Heading2"/>
@@ -17795,8 +18020,8 @@
         <w:t xml:space="preserve">.</w:t>
       </w:r>
     </w:p>
-    <w:bookmarkEnd w:id="229"/>
-    <w:bookmarkStart w:id="231" w:name="déroulé-et-script-de-séance-3"/>
+    <w:bookmarkEnd w:id="236"/>
+    <w:bookmarkStart w:id="238" w:name="déroulé-et-script-de-séance-3"/>
     <w:p>
       <w:pPr>
         <w:pStyle w:val="Heading2"/>
@@ -17955,7 +18180,7 @@
         </w:tc>
       </w:tr>
     </w:tbl>
-    <w:bookmarkStart w:id="230" w:name="Xd57b469ecdc66b5796ed91075dbb076e67bb630"/>
+    <w:bookmarkStart w:id="237" w:name="Xd57b469ecdc66b5796ed91075dbb076e67bb630"/>
     <w:p>
       <w:pPr>
         <w:pStyle w:val="Heading3"/>
@@ -18077,9 +18302,9 @@
         <w:t xml:space="preserve">« Maintenant, tu veux une carte qui glisse après le geste. Quelle partie gardes-tu sans Three.js ? Et pourquoi le simple passage de la souris ne doit-il pas reprendre la carte ? » Laisser relier geste actif et mouvement autonome, puis préparer un essai dans un nouveau contexte.</w:t>
       </w:r>
     </w:p>
-    <w:bookmarkEnd w:id="230"/>
-    <w:bookmarkEnd w:id="231"/>
-    <w:bookmarkStart w:id="232" w:name="repérer-et-travailler-une-difficulté-3"/>
+    <w:bookmarkEnd w:id="237"/>
+    <w:bookmarkEnd w:id="238"/>
+    <w:bookmarkStart w:id="239" w:name="repérer-et-travailler-une-difficulté-3"/>
     <w:p>
       <w:pPr>
         <w:pStyle w:val="Heading2"/>
@@ -18132,8 +18357,8 @@
         <w:t xml:space="preserve">et appliquer le cadre d’intervention commun à cette difficulté.</w:t>
       </w:r>
     </w:p>
-    <w:bookmarkEnd w:id="232"/>
-    <w:bookmarkStart w:id="233" w:name="transfert-et-retour-humain-3"/>
+    <w:bookmarkEnd w:id="239"/>
+    <w:bookmarkStart w:id="240" w:name="transfert-et-retour-humain-3"/>
     <w:p>
       <w:pPr>
         <w:pStyle w:val="Heading2"/>
@@ -18163,9 +18388,9 @@
         <w:t xml:space="preserve">. L’élève peut répondre par texte, schéma ou code annoté, puis essayer la proposition. Relier le retour humain au scénario de transfert effectivement examiné.</w:t>
       </w:r>
     </w:p>
-    <w:bookmarkEnd w:id="233"/>
-    <w:bookmarkEnd w:id="234"/>
-    <w:bookmarkStart w:id="241" w:name="Xe91184019d3a8f3df7d829b1bb207b93284c100"/>
+    <w:bookmarkEnd w:id="240"/>
+    <w:bookmarkEnd w:id="241"/>
+    <w:bookmarkStart w:id="248" w:name="Xe91184019d3a8f3df7d829b1bb207b93284c100"/>
     <w:p>
       <w:pPr>
         <w:pStyle w:val="Heading1"/>
@@ -18226,7 +18451,7 @@
       <w:r>
         <w:t xml:space="preserve"> </w:t>
       </w:r>
-      <w:hyperlink r:id="rId235">
+      <w:hyperlink r:id="rId242">
         <w:r>
           <w:rPr>
             <w:rStyle w:val="Hyperlink"/>
@@ -18241,7 +18466,7 @@
         <w:t xml:space="preserve">est une piste à examiner après la tentative. Retrouver la prédiction et la version réellement choisie avant de comparer.</w:t>
       </w:r>
     </w:p>
-    <w:bookmarkStart w:id="236" w:name="Xed34485779ea01c4244112ea88b927e2ba81c86"/>
+    <w:bookmarkStart w:id="243" w:name="Xed34485779ea01c4244112ea88b927e2ba81c86"/>
     <w:p>
       <w:pPr>
         <w:pStyle w:val="Heading2"/>
@@ -18323,8 +18548,8 @@
         <w:t xml:space="preserve">.</w:t>
       </w:r>
     </w:p>
-    <w:bookmarkEnd w:id="236"/>
-    <w:bookmarkStart w:id="238" w:name="déroulé-et-script-de-séance-4"/>
+    <w:bookmarkEnd w:id="243"/>
+    <w:bookmarkStart w:id="245" w:name="déroulé-et-script-de-séance-4"/>
     <w:p>
       <w:pPr>
         <w:pStyle w:val="Heading2"/>
@@ -18468,7 +18693,7 @@
         </w:tc>
       </w:tr>
     </w:tbl>
-    <w:bookmarkStart w:id="237" w:name="Xfbdaf3dd7ec46292ff9f7da20e9f123fb025f4e"/>
+    <w:bookmarkStart w:id="244" w:name="Xfbdaf3dd7ec46292ff9f7da20e9f123fb025f4e"/>
     <w:p>
       <w:pPr>
         <w:pStyle w:val="Heading3"/>
@@ -18575,9 +18800,9 @@
         <w:t xml:space="preserve">« Dans ton projet, quelle transition profiterait de ce mécanisme ? Et à quel moment préfères-tu un changement immédiat ? » Laisser proposer une fiche ou une caméra, avec une justification d’usage. Une préférence esthétique et une vérification technique sont deux traces distinctes.</w:t>
       </w:r>
     </w:p>
-    <w:bookmarkEnd w:id="237"/>
-    <w:bookmarkEnd w:id="238"/>
-    <w:bookmarkStart w:id="239" w:name="repérer-et-travailler-une-difficulté-4"/>
+    <w:bookmarkEnd w:id="244"/>
+    <w:bookmarkEnd w:id="245"/>
+    <w:bookmarkStart w:id="246" w:name="repérer-et-travailler-une-difficulté-4"/>
     <w:p>
       <w:pPr>
         <w:pStyle w:val="Heading2"/>
@@ -18630,8 +18855,8 @@
         <w:t xml:space="preserve">et appliquer le cadre d’intervention commun à cette difficulté.</w:t>
       </w:r>
     </w:p>
-    <w:bookmarkEnd w:id="239"/>
-    <w:bookmarkStart w:id="240" w:name="transfert-et-retour-humain-4"/>
+    <w:bookmarkEnd w:id="246"/>
+    <w:bookmarkStart w:id="247" w:name="transfert-et-retour-humain-4"/>
     <w:p>
       <w:pPr>
         <w:pStyle w:val="Heading2"/>
@@ -18661,9 +18886,9 @@
         <w:t xml:space="preserve">. L’élève peut répondre par texte, schéma ou code annoté, puis essayer la proposition. Relier le retour humain au scénario de transfert effectivement examiné.</w:t>
       </w:r>
     </w:p>
-    <w:bookmarkEnd w:id="240"/>
-    <w:bookmarkEnd w:id="241"/>
-    <w:bookmarkStart w:id="248" w:name="X46d8bced744f5a6853fccd8c6f87562ed71bfad"/>
+    <w:bookmarkEnd w:id="247"/>
+    <w:bookmarkEnd w:id="248"/>
+    <w:bookmarkStart w:id="255" w:name="X46d8bced744f5a6853fccd8c6f87562ed71bfad"/>
     <w:p>
       <w:pPr>
         <w:pStyle w:val="Heading1"/>
@@ -18724,7 +18949,7 @@
       <w:r>
         <w:t xml:space="preserve"> </w:t>
       </w:r>
-      <w:hyperlink r:id="rId242">
+      <w:hyperlink r:id="rId249">
         <w:r>
           <w:rPr>
             <w:rStyle w:val="Hyperlink"/>
@@ -18739,7 +18964,7 @@
         <w:t xml:space="preserve">est une piste à examiner après la tentative. Retrouver la prédiction et la version réellement choisie avant de comparer.</w:t>
       </w:r>
     </w:p>
-    <w:bookmarkStart w:id="243" w:name="Xfb768e2bb8f8a045e51ad025239b3e88c32e6d1"/>
+    <w:bookmarkStart w:id="250" w:name="Xfb768e2bb8f8a045e51ad025239b3e88c32e6d1"/>
     <w:p>
       <w:pPr>
         <w:pStyle w:val="Heading2"/>
@@ -18821,8 +19046,8 @@
         <w:t xml:space="preserve">.</w:t>
       </w:r>
     </w:p>
-    <w:bookmarkEnd w:id="243"/>
-    <w:bookmarkStart w:id="245" w:name="déroulé-et-script-de-séance-5"/>
+    <w:bookmarkEnd w:id="250"/>
+    <w:bookmarkStart w:id="252" w:name="déroulé-et-script-de-séance-5"/>
     <w:p>
       <w:pPr>
         <w:pStyle w:val="Heading2"/>
@@ -18966,7 +19191,7 @@
         </w:tc>
       </w:tr>
     </w:tbl>
-    <w:bookmarkStart w:id="244" w:name="Xfd9ca0e01267263a984267d8975763aeb8ddb25"/>
+    <w:bookmarkStart w:id="251" w:name="Xfd9ca0e01267263a984267d8975763aeb8ddb25"/>
     <w:p>
       <w:pPr>
         <w:pStyle w:val="Heading3"/>
@@ -19103,9 +19328,9 @@
         <w:t xml:space="preserve">« Pour ton projet, je te propose un effet qui souligne une sélection. Comment garder le texte lisible quand l’effet est désactivé ? » Laisser dessiner le parcours statique. Le choix d’un effet devient une décision expliquée, pas une obligation de multiplier les points.</w:t>
       </w:r>
     </w:p>
-    <w:bookmarkEnd w:id="244"/>
-    <w:bookmarkEnd w:id="245"/>
-    <w:bookmarkStart w:id="246" w:name="repérer-et-travailler-une-difficulté-5"/>
+    <w:bookmarkEnd w:id="251"/>
+    <w:bookmarkEnd w:id="252"/>
+    <w:bookmarkStart w:id="253" w:name="repérer-et-travailler-une-difficulté-5"/>
     <w:p>
       <w:pPr>
         <w:pStyle w:val="Heading2"/>
@@ -19158,8 +19383,8 @@
         <w:t xml:space="preserve">et appliquer le cadre d’intervention commun à cette difficulté.</w:t>
       </w:r>
     </w:p>
-    <w:bookmarkEnd w:id="246"/>
-    <w:bookmarkStart w:id="247" w:name="transfert-et-retour-humain-5"/>
+    <w:bookmarkEnd w:id="253"/>
+    <w:bookmarkStart w:id="254" w:name="transfert-et-retour-humain-5"/>
     <w:p>
       <w:pPr>
         <w:pStyle w:val="Heading2"/>
@@ -19189,9 +19414,9 @@
         <w:t xml:space="preserve">. L’élève peut répondre par texte, schéma ou code annoté, puis essayer la proposition. Relier le retour humain au scénario de transfert effectivement examiné.</w:t>
       </w:r>
     </w:p>
-    <w:bookmarkEnd w:id="247"/>
-    <w:bookmarkEnd w:id="248"/>
-    <w:bookmarkStart w:id="255" w:name="X6646f347121dc6cc70afe6d5506bf56540df81b"/>
+    <w:bookmarkEnd w:id="254"/>
+    <w:bookmarkEnd w:id="255"/>
+    <w:bookmarkStart w:id="262" w:name="X6646f347121dc6cc70afe6d5506bf56540df81b"/>
     <w:p>
       <w:pPr>
         <w:pStyle w:val="Heading1"/>
@@ -19252,7 +19477,7 @@
       <w:r>
         <w:t xml:space="preserve"> </w:t>
       </w:r>
-      <w:hyperlink r:id="rId249">
+      <w:hyperlink r:id="rId256">
         <w:r>
           <w:rPr>
             <w:rStyle w:val="Hyperlink"/>
@@ -19267,7 +19492,7 @@
         <w:t xml:space="preserve">est une piste à examiner après la tentative. Retrouver la prédiction et la version réellement choisie avant de comparer.</w:t>
       </w:r>
     </w:p>
-    <w:bookmarkStart w:id="250" w:name="Xe83a7275a77a31672d808ead7c54617082a9565"/>
+    <w:bookmarkStart w:id="257" w:name="Xe83a7275a77a31672d808ead7c54617082a9565"/>
     <w:p>
       <w:pPr>
         <w:pStyle w:val="Heading2"/>
@@ -19349,8 +19574,8 @@
         <w:t xml:space="preserve">.</w:t>
       </w:r>
     </w:p>
-    <w:bookmarkEnd w:id="250"/>
-    <w:bookmarkStart w:id="252" w:name="déroulé-et-script-de-séance-6"/>
+    <w:bookmarkEnd w:id="257"/>
+    <w:bookmarkStart w:id="259" w:name="déroulé-et-script-de-séance-6"/>
     <w:p>
       <w:pPr>
         <w:pStyle w:val="Heading2"/>
@@ -19494,7 +19719,7 @@
         </w:tc>
       </w:tr>
     </w:tbl>
-    <w:bookmarkStart w:id="251" w:name="Xe9c32c93866176e8957ddc773ad4d830f9e88e7"/>
+    <w:bookmarkStart w:id="258" w:name="Xe9c32c93866176e8957ddc773ad4d830f9e88e7"/>
     <w:p>
       <w:pPr>
         <w:pStyle w:val="Heading3"/>
@@ -19614,9 +19839,9 @@
         <w:t xml:space="preserve">« Si cette vue devient une galerie, que faut-il conserver lorsque tu ouvres une image puis reviens ? Et si la page est figée, quelle horloge doit rester en place ? » Accepter schéma ou code annoté, avec un essai nouveau avant une conclusion de compréhension.</w:t>
       </w:r>
     </w:p>
-    <w:bookmarkEnd w:id="251"/>
-    <w:bookmarkEnd w:id="252"/>
-    <w:bookmarkStart w:id="253" w:name="repérer-et-travailler-une-difficulté-6"/>
+    <w:bookmarkEnd w:id="258"/>
+    <w:bookmarkEnd w:id="259"/>
+    <w:bookmarkStart w:id="260" w:name="repérer-et-travailler-une-difficulté-6"/>
     <w:p>
       <w:pPr>
         <w:pStyle w:val="Heading2"/>
@@ -19669,8 +19894,8 @@
         <w:t xml:space="preserve">et appliquer le cadre d’intervention commun à cette difficulté.</w:t>
       </w:r>
     </w:p>
-    <w:bookmarkEnd w:id="253"/>
-    <w:bookmarkStart w:id="254" w:name="transfert-et-retour-humain-6"/>
+    <w:bookmarkEnd w:id="260"/>
+    <w:bookmarkStart w:id="261" w:name="transfert-et-retour-humain-6"/>
     <w:p>
       <w:pPr>
         <w:pStyle w:val="Heading2"/>
@@ -19700,9 +19925,9 @@
         <w:t xml:space="preserve">. L’élève peut répondre par texte, schéma ou code annoté, puis essayer la proposition. Relier le retour humain au scénario de transfert effectivement examiné.</w:t>
       </w:r>
     </w:p>
-    <w:bookmarkEnd w:id="254"/>
-    <w:bookmarkEnd w:id="255"/>
-    <w:bookmarkStart w:id="263" w:name="X0220dd7f06a83684b6b9509e96759b1bf1082d1"/>
+    <w:bookmarkEnd w:id="261"/>
+    <w:bookmarkEnd w:id="262"/>
+    <w:bookmarkStart w:id="270" w:name="X0220dd7f06a83684b6b9509e96759b1bf1082d1"/>
     <w:p>
       <w:pPr>
         <w:pStyle w:val="Heading1"/>
@@ -19763,7 +19988,7 @@
       <w:r>
         <w:t xml:space="preserve"> </w:t>
       </w:r>
-      <w:hyperlink r:id="rId256">
+      <w:hyperlink r:id="rId263">
         <w:r>
           <w:rPr>
             <w:rStyle w:val="Hyperlink"/>
@@ -19778,7 +20003,7 @@
         <w:t xml:space="preserve">est une piste à examiner après la tentative. Retrouver la prédiction et la version réellement choisie avant de comparer.</w:t>
       </w:r>
     </w:p>
-    <w:bookmarkStart w:id="257" w:name="Xbb83319ed0d1271717ad7653e0e423fc16ff899"/>
+    <w:bookmarkStart w:id="264" w:name="Xbb83319ed0d1271717ad7653e0e423fc16ff899"/>
     <w:p>
       <w:pPr>
         <w:pStyle w:val="Heading2"/>
@@ -19860,8 +20085,8 @@
         <w:t xml:space="preserve">.</w:t>
       </w:r>
     </w:p>
-    <w:bookmarkEnd w:id="257"/>
-    <w:bookmarkStart w:id="260" w:name="déroulé-et-script-de-séance-7"/>
+    <w:bookmarkEnd w:id="264"/>
+    <w:bookmarkStart w:id="267" w:name="déroulé-et-script-de-séance-7"/>
     <w:p>
       <w:pPr>
         <w:pStyle w:val="Heading2"/>
@@ -20005,7 +20230,7 @@
         </w:tc>
       </w:tr>
     </w:tbl>
-    <w:bookmarkStart w:id="258" w:name="la-découverte-de-fin-de-leçon"/>
+    <w:bookmarkStart w:id="265" w:name="la-découverte-de-fin-de-leçon"/>
     <w:p>
       <w:pPr>
         <w:pStyle w:val="Heading3"/>
@@ -20279,8 +20504,8 @@
         <w:t xml:space="preserve">. L’assemblage du ZIP ne compile pas Astro : la compilation et le parcours du projet sont vérifiés séparément. Une modification hors du contrat appelle une adaptation expliquée ; elle ne justifie pas une substitution silencieuse du travail.</w:t>
       </w:r>
     </w:p>
-    <w:bookmarkEnd w:id="258"/>
-    <w:bookmarkStart w:id="259" w:name="Xfa25f72e2939c046e78271a1ccbba96ae752d56"/>
+    <w:bookmarkEnd w:id="265"/>
+    <w:bookmarkStart w:id="266" w:name="Xfa25f72e2939c046e78271a1ccbba96ae752d56"/>
     <w:p>
       <w:pPr>
         <w:pStyle w:val="Heading3"/>
@@ -20400,9 +20625,9 @@
         <w:t xml:space="preserve">« Ce socle appartient maintenant à ton projet. Quel usage veux-tu en faire ? Et quelle capacité utile donneras-tu à ton assistant, avec un partage précis ? » Faire expliquer un nouvel usage et un contrôle. Garder les incertitudes pour la revue finale.</w:t>
       </w:r>
     </w:p>
-    <w:bookmarkEnd w:id="259"/>
-    <w:bookmarkEnd w:id="260"/>
-    <w:bookmarkStart w:id="261" w:name="repérer-et-travailler-une-difficulté-7"/>
+    <w:bookmarkEnd w:id="266"/>
+    <w:bookmarkEnd w:id="267"/>
+    <w:bookmarkStart w:id="268" w:name="repérer-et-travailler-une-difficulté-7"/>
     <w:p>
       <w:pPr>
         <w:pStyle w:val="Heading2"/>
@@ -20455,8 +20680,8 @@
         <w:t xml:space="preserve">et appliquer le cadre d’intervention commun à cette difficulté.</w:t>
       </w:r>
     </w:p>
-    <w:bookmarkEnd w:id="261"/>
-    <w:bookmarkStart w:id="262" w:name="transfert-et-retour-humain-7"/>
+    <w:bookmarkEnd w:id="268"/>
+    <w:bookmarkStart w:id="269" w:name="transfert-et-retour-humain-7"/>
     <w:p>
       <w:pPr>
         <w:pStyle w:val="Heading2"/>
@@ -20486,9 +20711,9 @@
         <w:t xml:space="preserve">. L’élève peut répondre par texte, schéma ou code annoté, puis essayer la proposition. Relier le retour humain au scénario de transfert effectivement examiné.</w:t>
       </w:r>
     </w:p>
-    <w:bookmarkEnd w:id="262"/>
-    <w:bookmarkEnd w:id="263"/>
-    <w:bookmarkStart w:id="269" w:name="Xe7b72d48485aa449da51b9d102c88157f80687e"/>
+    <w:bookmarkEnd w:id="269"/>
+    <w:bookmarkEnd w:id="270"/>
+    <w:bookmarkStart w:id="276" w:name="Xe7b72d48485aa449da51b9d102c88157f80687e"/>
     <w:p>
       <w:pPr>
         <w:pStyle w:val="Heading1"/>
@@ -20497,7 +20722,7 @@
         <w:t xml:space="preserve">Fiche enseignant projet — cadrage et clôture</w:t>
       </w:r>
     </w:p>
-    <w:bookmarkStart w:id="264" w:name="une-heure-de-cadrage"/>
+    <w:bookmarkStart w:id="271" w:name="une-heure-de-cadrage"/>
     <w:p>
       <w:pPr>
         <w:pStyle w:val="Heading2"/>
@@ -20710,8 +20935,8 @@
         <w:t xml:space="preserve">L’idée appartient à l’élève. La contribution 3D sert un usage expliqué et le contenu conserve une alternative HTML. Les briques fournies, les modifications et le raccordement sont attribués séparément.</w:t>
       </w:r>
     </w:p>
-    <w:bookmarkEnd w:id="264"/>
-    <w:bookmarkStart w:id="265" w:name="six-heures-solo-suivies-de-la-clôture"/>
+    <w:bookmarkEnd w:id="271"/>
+    <w:bookmarkStart w:id="272" w:name="six-heures-solo-suivies-de-la-clôture"/>
     <w:p>
       <w:pPr>
         <w:pStyle w:val="Heading2"/>
@@ -20728,8 +20953,8 @@
         <w:t xml:space="preserve">Distribuer 1 h de préparation, 2 h d’adaptation, 2 h d’intégration/expérience et 1 h de préparation de remise. Dans le calendrier, cela correspond aux derniers modules. La séance de clôture suit ce travail ; aucune heure accompagnée supplémentaire n’est ajoutée.</w:t>
       </w:r>
     </w:p>
-    <w:bookmarkEnd w:id="265"/>
-    <w:bookmarkStart w:id="267" w:name="une-heure-de-clôture"/>
+    <w:bookmarkEnd w:id="272"/>
+    <w:bookmarkStart w:id="274" w:name="une-heure-de-clôture"/>
     <w:p>
       <w:pPr>
         <w:pStyle w:val="Heading2"/>
@@ -20970,7 +21195,7 @@
         </w:tc>
       </w:tr>
     </w:tbl>
-    <w:bookmarkStart w:id="266" w:name="X4c7103b88c021e55ce8cb0486b897eed341e04e"/>
+    <w:bookmarkStart w:id="273" w:name="X4c7103b88c021e55ce8cb0486b897eed341e04e"/>
     <w:p>
       <w:pPr>
         <w:pStyle w:val="Heading3"/>
@@ -21077,9 +21302,9 @@
         <w:t xml:space="preserve">« Tu pourrais réutiliser cette notion ailleurs. Propose un exemple qui n’est pas cette scène. Quelle donnée ou quelle règle garderais-tu ? » Laisser reformuler puis définir une prochaine vérification utile.</w:t>
       </w:r>
     </w:p>
-    <w:bookmarkEnd w:id="266"/>
-    <w:bookmarkEnd w:id="267"/>
-    <w:bookmarkStart w:id="268" w:name="revue-de-projet"/>
+    <w:bookmarkEnd w:id="273"/>
+    <w:bookmarkEnd w:id="274"/>
+    <w:bookmarkStart w:id="275" w:name="revue-de-projet"/>
     <w:p>
       <w:pPr>
         <w:pStyle w:val="Heading2"/>
@@ -21104,9 +21329,9 @@
         <w:t xml:space="preserve">Conserver une grille : intention, attribution, état, accessibilité, expérience, capacité bornée, reprise et transfert. Chaque ligne reçoit le scénario, le constat et sa limite. L’enseignant garde son retour séparé de la proposition de l’assistant et de l’empreinte des fichiers. La publication publique reste une action distincte.</w:t>
       </w:r>
     </w:p>
-    <w:bookmarkEnd w:id="268"/>
-    <w:bookmarkEnd w:id="269"/>
-    <w:bookmarkStart w:id="270" w:name="X3bbe71c80c1063c9a59ac20850f057d42c1f65a"/>
+    <w:bookmarkEnd w:id="275"/>
+    <w:bookmarkEnd w:id="276"/>
+    <w:bookmarkStart w:id="277" w:name="X3bbe71c80c1063c9a59ac20850f057d42c1f65a"/>
     <w:p>
       <w:pPr>
         <w:pStyle w:val="Heading1"/>
@@ -21131,8 +21356,8 @@
         <w:t xml:space="preserve">Les scripts et les critères de ce manuel préparent cet examen. Les observations d’apprentissage appartiennent aux séances réellement effectuées.</w:t>
       </w:r>
     </w:p>
-    <w:bookmarkEnd w:id="270"/>
-    <w:bookmarkStart w:id="283" w:name="annexes"/>
+    <w:bookmarkEnd w:id="277"/>
+    <w:bookmarkStart w:id="290" w:name="annexes"/>
     <w:p>
       <w:pPr>
         <w:pStyle w:val="Heading1"/>
@@ -21141,7 +21366,7 @@
         <w:t xml:space="preserve">Annexes</w:t>
       </w:r>
     </w:p>
-    <w:bookmarkStart w:id="271" w:name="a-remettre-et-reprendre-un-travail"/>
+    <w:bookmarkStart w:id="278" w:name="a-remettre-et-reprendre-un-travail"/>
     <w:p>
       <w:pPr>
         <w:pStyle w:val="Heading2"/>
@@ -21190,8 +21415,8 @@
         <w:t xml:space="preserve">À la fin du Module 8, charger les huit exports, examiner leurs versions déclarées et leurs empreintes, puis confirmer l’empreinte de cette sélection avant d’assembler. Les cellules 13, 14 et 15 conservent ces trois étapes. Le sélecteur officiel permet l’annulation et la reprise. Si son dialogue reste indisponible, le panneau Fichiers de Colab permet de téléverser les mêmes ZIP ; l’élève active ensuite la lecture des huit noms qu’il a explicitement déclarés. L’assemblage téléchargé reste distinct de sa compilation et de la compréhension examinée pendant la séance.</w:t>
       </w:r>
     </w:p>
-    <w:bookmarkEnd w:id="271"/>
-    <w:bookmarkStart w:id="272" w:name="X649497928fa411fd0faeef956b2cdc47b4c8400"/>
+    <w:bookmarkEnd w:id="278"/>
+    <w:bookmarkStart w:id="279" w:name="X649497928fa411fd0faeef956b2cdc47b4c8400"/>
     <w:p>
       <w:pPr>
         <w:pStyle w:val="Heading2"/>
@@ -21944,8 +22169,8 @@
         <w:t xml:space="preserve">, seuls ou par paires sur les mêmes données. Une session neuve n’en exécute aucun implicitement. Leurs résultats restent séparés ; une moyenne ou un vote ne désigne pas un gagnant. T et F peuvent coexister, I peut subsister et ces ensembles ne constituent pas des probabilités. Une date différente demande une relation de version justifiée ; deux attributs manquants restent inconnus.</w:t>
       </w:r>
     </w:p>
-    <w:bookmarkEnd w:id="272"/>
-    <w:bookmarkStart w:id="273" w:name="c-installer-le-plugin-dans-son-studio"/>
+    <w:bookmarkEnd w:id="279"/>
+    <w:bookmarkStart w:id="280" w:name="c-installer-le-plugin-dans-son-studio"/>
     <w:p>
       <w:pPr>
         <w:pStyle w:val="Heading2"/>
@@ -21993,8 +22218,8 @@
         <w:t xml:space="preserve">conserve le projet et le dataset de l’équipe, avec un autre point de montage. La session et les droits appartiennent toujours à Sanity. Deux routes sur la même origine gardent le même périmètre d’utilisateur; elles ne créent pas une séparation de confidentialité. Installer le plugin dans le Studio personnel de l’élève utilise son propre projet, dataset et session. Le transport public du cours et cette session authentifiée gardent des autorisations distinctes.</w:t>
       </w:r>
     </w:p>
-    <w:bookmarkEnd w:id="273"/>
-    <w:bookmarkStart w:id="274" w:name="d-carte-du-code"/>
+    <w:bookmarkEnd w:id="280"/>
+    <w:bookmarkStart w:id="281" w:name="d-carte-du-code"/>
     <w:p>
       <w:pPr>
         <w:pStyle w:val="Heading2"/>
@@ -22571,8 +22796,8 @@
         </w:tc>
       </w:tr>
     </w:tbl>
-    <w:bookmarkEnd w:id="274"/>
-    <w:bookmarkStart w:id="275" w:name="e-glossaire-glossary"/>
+    <w:bookmarkEnd w:id="281"/>
+    <w:bookmarkStart w:id="282" w:name="e-glossaire-glossary"/>
     <w:p>
       <w:pPr>
         <w:pStyle w:val="Heading2"/>
@@ -23196,8 +23421,8 @@
         </w:tc>
       </w:tr>
     </w:tbl>
-    <w:bookmarkEnd w:id="275"/>
-    <w:bookmarkStart w:id="276" w:name="f-symboles-et-unités"/>
+    <w:bookmarkEnd w:id="282"/>
+    <w:bookmarkStart w:id="283" w:name="f-symboles-et-unités"/>
     <w:p>
       <w:pPr>
         <w:pStyle w:val="Heading2"/>
@@ -23556,8 +23781,8 @@
         <w:t xml:space="preserve">Les nombres servent ici aux mécanismes d’interface. Une graine répétable, une sphère ou une trajectoire ne donnent pas une validation physique du modèle.</w:t>
       </w:r>
     </w:p>
-    <w:bookmarkEnd w:id="276"/>
-    <w:bookmarkStart w:id="277" w:name="g-index-des-notions-concept-index"/>
+    <w:bookmarkEnd w:id="283"/>
+    <w:bookmarkStart w:id="284" w:name="g-index-des-notions-concept-index"/>
     <w:p>
       <w:pPr>
         <w:pStyle w:val="Heading2"/>
@@ -23686,8 +23911,8 @@
         <w:t xml:space="preserve">Transfert : critères de chaque module ; clôture du projet.</w:t>
       </w:r>
     </w:p>
-    <w:bookmarkEnd w:id="277"/>
-    <w:bookmarkStart w:id="281" w:name="h-sources-et-références"/>
+    <w:bookmarkEnd w:id="284"/>
+    <w:bookmarkStart w:id="288" w:name="h-sources-et-références"/>
     <w:p>
       <w:pPr>
         <w:pStyle w:val="Heading2"/>
@@ -23744,7 +23969,7 @@
           <w:numId w:val="1014"/>
         </w:numPr>
       </w:pPr>
-      <w:hyperlink r:id="rId278">
+      <w:hyperlink r:id="rId285">
         <w:r>
           <w:rPr>
             <w:rStyle w:val="Hyperlink"/>
@@ -23764,7 +23989,7 @@
           <w:numId w:val="1014"/>
         </w:numPr>
       </w:pPr>
-      <w:hyperlink r:id="rId279">
+      <w:hyperlink r:id="rId286">
         <w:r>
           <w:rPr>
             <w:rStyle w:val="Hyperlink"/>
@@ -23784,7 +24009,7 @@
           <w:numId w:val="1014"/>
         </w:numPr>
       </w:pPr>
-      <w:hyperlink r:id="rId280">
+      <w:hyperlink r:id="rId287">
         <w:r>
           <w:rPr>
             <w:rStyle w:val="Hyperlink"/>
@@ -23916,8 +24141,8 @@
         <w:t xml:space="preserve">.</w:t>
       </w:r>
     </w:p>
-    <w:bookmarkEnd w:id="281"/>
-    <w:bookmarkStart w:id="282" w:name="mot-de-clôture"/>
+    <w:bookmarkEnd w:id="288"/>
+    <w:bookmarkStart w:id="289" w:name="mot-de-clôture"/>
     <w:p>
       <w:pPr>
         <w:pStyle w:val="Heading2"/>
@@ -23934,9 +24159,9 @@
         <w:t xml:space="preserve">L’élève choisit une production qu’il peut montrer et une notion qu’il peut expliquer dans un nouvel exemple. L’enseignant conserve ce qui a été effectivement examiné et prépare la question suivante. Le manuel et ses documents web soutiennent ce travail concret ; la revue humaine en garde la responsabilité.</w:t>
       </w:r>
     </w:p>
-    <w:bookmarkEnd w:id="282"/>
-    <w:bookmarkEnd w:id="283"/>
-    <w:bookmarkStart w:id="284" w:name="empreintes-intégrales-de-lecture"/>
+    <w:bookmarkEnd w:id="289"/>
+    <w:bookmarkEnd w:id="290"/>
+    <w:bookmarkStart w:id="291" w:name="empreintes-intégrales-de-lecture"/>
     <w:p>
       <w:pPr>
         <w:pStyle w:val="Heading1"/>
@@ -24143,7 +24368,7 @@
         <w:t xml:space="preserve">20  1426f7985237d66f60736b2b55e96e8b47aa6d9736e161ce25bef40b461b031b</w:t>
       </w:r>
     </w:p>
-    <w:bookmarkEnd w:id="284"/>
+    <w:bookmarkEnd w:id="291"/>
     <w:sectPr>
       <w:pgSz w:h="16838" w:w="11906"/>
       <w:pgMar w:bottom="1247" w:footer="720" w:gutter="0" w:header="720" w:left="1247" w:right="1247" w:top="1247"/>

</xml_diff>